<commit_message>
docs(report): correct and render-verify team report draft
</commit_message>
<xml_diff>
--- a/docs/report/Pacific_BioArchive_Team_Report_DRAFT.docx
+++ b/docs/report/Pacific_BioArchive_Team_Report_DRAFT.docx
@@ -169,7 +169,7 @@
           <w:i w:val="0"/>
           <w:sz w:val="24"/>
         </w:rPr>
-        <w:t>Amazon Cognito issues short-lived JWTs that API Gateway validates before invoking separate least-privilege functions. CloudFront serves the React SPA from a private S3 origin. The core Lambda owns lightweight API orchestration; two 3008 MiB image-based Lambdas isolate supplied-model processing and temporary visual query. Stable S3 keys, not expiring signed URLs, are persisted. ECR digest pinning makes the runtime reproducible, while seven-day CloudWatch logs and alarms support troubleshooting.</w:t>
+        <w:t>Amazon Cognito issues short-lived JWTs that API Gateway validates before invoking separate least-privilege functions. CloudFront serves the React SPA from a private S3 origin. The core Lambda owns lightweight API orchestration; two 3008 MiB image-based Lambdas isolate supplied-model processing and temporary visual query. Stable S3 keys, not expiring signed URLs, are persisted. ECR digest pinning makes the runtime reproducible, while seven-day CloudWatch logs support troubleshooting.</w:t>
       </w:r>
     </w:p>
     <w:p>
@@ -213,7 +213,7 @@
           <w:i w:val="0"/>
           <w:sz w:val="24"/>
         </w:rPr>
-        <w:t>Automated evidence currently records 110 passing backend tests with 90.12% domain/application coverage and 20 passing frontend tests plus TypeScript, production build, ESLint and CloudFormation lint gates. Three hash-bound supplied fixtures produce the expected australian brushturkey, southern cassowary and domestic cat predictions locally and in the Linux Lambda image. The ML image is published by branch-bound GitHub OIDC as an immutable Sydney ECR digest. Final submission must add the completed live Cognito, SNS, CloudFront and end-to-end AWS evidence; mocked results are not represented as live proof.</w:t>
+        <w:t>Automated evidence currently records 114 passing backend tests with 90.12% domain/application coverage and 20 passing frontend tests plus TypeScript, production build, ESLint and CloudFormation lint gates. Three hash-bound supplied fixtures produce the expected australian brushturkey, southern cassowary and domestic cat predictions locally and in the Linux Lambda image. The ML image is published by branch-bound GitHub OIDC as an immutable Sydney ECR digest. Final submission must add the completed live Cognito, SNS, CloudFront and end-to-end AWS evidence; mocked results are not represented as live proof.</w:t>
       </w:r>
     </w:p>
     <w:p>

</xml_diff>